<commit_message>
Insert affiliation (Spatial Computing (Fujian) Technology Co., Ltd.) in all manuscripts, SI and cover letter
Co-Authored-By: Claude Opus 5 <noreply@anthropic.com>
</commit_message>
<xml_diff>
--- a/outputs/research/manuscript/docx/中文投稿稿_v1.0.docx
+++ b/outputs/research/manuscript/docx/中文投稿稿_v1.0.docx
@@ -67,7 +67,16 @@
         <w:rPr>
           <w:rFonts w:hint="eastAsia"/>
         </w:rPr>
-        <w:t xml:space="preserve">[单位名称]，[城市]，[邮编]）</w:t>
+        <w:t xml:space="preserve">空间计算（福建）科技有限公司，福建</w:t>
+      </w:r>
+      <w:r>
+        <w:t xml:space="preserve"> </w:t>
+      </w:r>
+      <w:r>
+        <w:rPr>
+          <w:rFonts w:hint="eastAsia"/>
+        </w:rPr>
+        <w:t xml:space="preserve">福州）</w:t>
       </w:r>
     </w:p>
     <w:p>

</xml_diff>

<commit_message>
Chinese-labelled figures embedded in the Chinese manuscript; package script builds it
Co-Authored-By: Claude Opus 5 <noreply@anthropic.com>
</commit_message>
<xml_diff>
--- a/outputs/research/manuscript/docx/中文投稿稿_v1.0.docx
+++ b/outputs/research/manuscript/docx/中文投稿稿_v1.0.docx
@@ -2,7 +2,7 @@
 <file path=word/document.xml><?xml version="1.0" encoding="utf-8"?>
 <w:document xmlns:w="http://schemas.openxmlformats.org/wordprocessingml/2006/main" xmlns:m="http://schemas.openxmlformats.org/officeDocument/2006/math" xmlns:r="http://schemas.openxmlformats.org/officeDocument/2006/relationships" xmlns:o="urn:schemas-microsoft-com:office:office" xmlns:v="urn:schemas-microsoft-com:vml" xmlns:w10="urn:schemas-microsoft-com:office:word" xmlns:a="http://schemas.openxmlformats.org/drawingml/2006/main" xmlns:pic="http://schemas.openxmlformats.org/drawingml/2006/picture" xmlns:wp="http://schemas.openxmlformats.org/drawingml/2006/wordprocessingDrawing">
   <w:body>
-    <w:bookmarkStart w:id="25" w:name="分时电价形状与算力负荷时间转移价值面向中国省级电力系统的情景分析"/>
+    <w:bookmarkStart w:id="34" w:name="分时电价形状与算力负荷时间转移价值面向中国省级电力系统的情景分析"/>
     <w:p>
       <w:pPr>
         <w:pStyle w:val="Heading1"/>
@@ -2264,7 +2264,7 @@
       </w:r>
     </w:p>
     <w:bookmarkEnd w:id="23"/>
-    <w:bookmarkStart w:id="24" w:name="参考文献"/>
+    <w:bookmarkStart w:id="33" w:name="参考文献"/>
     <w:p>
       <w:pPr>
         <w:pStyle w:val="Heading2"/>
@@ -2552,6 +2552,53 @@
       </w:r>
       <w:r>
         <w:t xml:space="preserve">[22] Stojkovic J, Zhang C, Goiri Í, et al. DynamoLLM: designing LLM inference clusters for performance and energy efficiency[C]//Proceedings of the IEEE International Symposium on High-Performance Computer Architecture. Piscataway: IEEE, 2025: 1348-1362.</w:t>
+      </w:r>
+    </w:p>
+    <w:p>
+      <w:pPr>
+        <w:pStyle w:val="BodyText"/>
+      </w:pPr>
+      <w:r>
+        <w:drawing>
+          <wp:inline>
+            <wp:extent cx="5334000" cy="2074333"/>
+            <wp:effectExtent b="0" l="0" r="0" t="0"/>
+            <wp:docPr descr="" title="" id="25" name="Picture"/>
+            <a:graphic>
+              <a:graphicData uri="http://schemas.openxmlformats.org/drawingml/2006/picture">
+                <pic:pic>
+                  <pic:nvPicPr>
+                    <pic:cNvPr descr="../figures/submission_zh/zh_fig1_realised_share.png" id="26" name="Picture"/>
+                    <pic:cNvPicPr>
+                      <a:picLocks noChangeArrowheads="1" noChangeAspect="1"/>
+                    </pic:cNvPicPr>
+                  </pic:nvPicPr>
+                  <pic:blipFill>
+                    <a:blip r:embed="rId24"/>
+                    <a:stretch>
+                      <a:fillRect/>
+                    </a:stretch>
+                  </pic:blipFill>
+                  <pic:spPr bwMode="auto">
+                    <a:xfrm>
+                      <a:off x="0" y="0"/>
+                      <a:ext cx="5334000" cy="2074333"/>
+                    </a:xfrm>
+                    <a:prstGeom prst="rect">
+                      <a:avLst/>
+                    </a:prstGeom>
+                    <a:noFill/>
+                    <a:ln w="9525">
+                      <a:noFill/>
+                      <a:headEnd/>
+                      <a:tailEnd/>
+                    </a:ln>
+                  </pic:spPr>
+                </pic:pic>
+              </a:graphicData>
+            </a:graphic>
+          </wp:inline>
+        </w:drawing>
       </w:r>
     </w:p>
     <w:p>
@@ -2607,7 +2654,89 @@
         <w:rPr>
           <w:rFonts w:hint="eastAsia"/>
         </w:rPr>
-        <w:t xml:space="preserve">S1、S3、S1rt；负值表示转移使系统成本高于不转移（图文件：figures/submission/fig3_realised_share.pdf）。</w:t>
+        <w:t xml:space="preserve">S1、S3、S1rt；负值表示转移使系统成本高于不转移，低于</w:t>
+      </w:r>
+      <w:r>
+        <w:t xml:space="preserve"> −0.6 </w:t>
+      </w:r>
+      <w:r>
+        <w:rPr>
+          <w:rFonts w:hint="eastAsia"/>
+        </w:rPr>
+        <w:t xml:space="preserve">的柱截断显示并标注数值（松弛</w:t>
+      </w:r>
+      <w:r>
+        <w:t xml:space="preserve"> 6 </w:t>
+      </w:r>
+      <w:r>
+        <w:rPr>
+          <w:rFonts w:hint="eastAsia"/>
+        </w:rPr>
+        <w:t xml:space="preserve">h，空闲功率</w:t>
+      </w:r>
+      <w:r>
+        <w:t xml:space="preserve"> </w:t>
+      </w:r>
+      <w:r>
+        <w:rPr>
+          <w:rFonts w:hint="eastAsia"/>
+        </w:rPr>
+        <w:t xml:space="preserve">41%）。</w:t>
+      </w:r>
+    </w:p>
+    <w:p>
+      <w:pPr>
+        <w:pStyle w:val="BodyText"/>
+      </w:pPr>
+      <w:r>
+        <w:t xml:space="preserve">Fig. 1 Share of shifting value realised, (S0e − X)/(S0e − S2), for X = S1, S3 and S1rt, islanded provinces</w:t>
+      </w:r>
+    </w:p>
+    <w:p>
+      <w:pPr>
+        <w:pStyle w:val="BodyText"/>
+      </w:pPr>
+      <w:r>
+        <w:drawing>
+          <wp:inline>
+            <wp:extent cx="5334000" cy="2148416"/>
+            <wp:effectExtent b="0" l="0" r="0" t="0"/>
+            <wp:docPr descr="" title="" id="28" name="Picture"/>
+            <a:graphic>
+              <a:graphicData uri="http://schemas.openxmlformats.org/drawingml/2006/picture">
+                <pic:pic>
+                  <pic:nvPicPr>
+                    <pic:cNvPr descr="../figures/submission_zh/zh_fig2_cost_by_scenario.png" id="29" name="Picture"/>
+                    <pic:cNvPicPr>
+                      <a:picLocks noChangeArrowheads="1" noChangeAspect="1"/>
+                    </pic:cNvPicPr>
+                  </pic:nvPicPr>
+                  <pic:blipFill>
+                    <a:blip r:embed="rId27"/>
+                    <a:stretch>
+                      <a:fillRect/>
+                    </a:stretch>
+                  </pic:blipFill>
+                  <pic:spPr bwMode="auto">
+                    <a:xfrm>
+                      <a:off x="0" y="0"/>
+                      <a:ext cx="5334000" cy="2148416"/>
+                    </a:xfrm>
+                    <a:prstGeom prst="rect">
+                      <a:avLst/>
+                    </a:prstGeom>
+                    <a:noFill/>
+                    <a:ln w="9525">
+                      <a:noFill/>
+                      <a:headEnd/>
+                      <a:tailEnd/>
+                    </a:ln>
+                  </pic:spPr>
+                </pic:pic>
+              </a:graphicData>
+            </a:graphic>
+          </wp:inline>
+        </w:drawing>
       </w:r>
     </w:p>
     <w:p>
@@ -2654,7 +2783,89 @@
         <w:rPr>
           <w:rFonts w:hint="eastAsia"/>
         </w:rPr>
-        <w:t xml:space="preserve">41%）（图文件：figures/submission/fig2_cost_by_scenario.pdf）。</w:t>
+        <w:t xml:space="preserve">41%，AI</w:t>
+      </w:r>
+      <w:r>
+        <w:t xml:space="preserve"> </w:t>
+      </w:r>
+      <w:r>
+        <w:rPr>
+          <w:rFonts w:hint="eastAsia"/>
+        </w:rPr>
+        <w:t xml:space="preserve">负荷占</w:t>
+      </w:r>
+      <w:r>
+        <w:t xml:space="preserve"> 2030 </w:t>
+      </w:r>
+      <w:r>
+        <w:rPr>
+          <w:rFonts w:hint="eastAsia"/>
+        </w:rPr>
+        <w:t xml:space="preserve">年峰荷</w:t>
+      </w:r>
+      <w:r>
+        <w:t xml:space="preserve"> </w:t>
+      </w:r>
+      <w:r>
+        <w:rPr>
+          <w:rFonts w:hint="eastAsia"/>
+        </w:rPr>
+        <w:t xml:space="preserve">5%、10%、20%）。</w:t>
+      </w:r>
+    </w:p>
+    <w:p>
+      <w:pPr>
+        <w:pStyle w:val="BodyText"/>
+      </w:pPr>
+      <w:r>
+        <w:t xml:space="preserve">Fig. 2 Reduction of incremental system cost relative to rigid operation by scenario, islanded provinces</w:t>
+      </w:r>
+    </w:p>
+    <w:p>
+      <w:pPr>
+        <w:pStyle w:val="BodyText"/>
+      </w:pPr>
+      <w:r>
+        <w:drawing>
+          <wp:inline>
+            <wp:extent cx="5334000" cy="1852083"/>
+            <wp:effectExtent b="0" l="0" r="0" t="0"/>
+            <wp:docPr descr="" title="" id="31" name="Picture"/>
+            <a:graphic>
+              <a:graphicData uri="http://schemas.openxmlformats.org/drawingml/2006/picture">
+                <pic:pic>
+                  <pic:nvPicPr>
+                    <pic:cNvPr descr="../figures/submission_zh/zh_fig3_robustness.png" id="32" name="Picture"/>
+                    <pic:cNvPicPr>
+                      <a:picLocks noChangeArrowheads="1" noChangeAspect="1"/>
+                    </pic:cNvPicPr>
+                  </pic:nvPicPr>
+                  <pic:blipFill>
+                    <a:blip r:embed="rId30"/>
+                    <a:stretch>
+                      <a:fillRect/>
+                    </a:stretch>
+                  </pic:blipFill>
+                  <pic:spPr bwMode="auto">
+                    <a:xfrm>
+                      <a:off x="0" y="0"/>
+                      <a:ext cx="5334000" cy="1852083"/>
+                    </a:xfrm>
+                    <a:prstGeom prst="rect">
+                      <a:avLst/>
+                    </a:prstGeom>
+                    <a:noFill/>
+                    <a:ln w="9525">
+                      <a:noFill/>
+                      <a:headEnd/>
+                      <a:tailEnd/>
+                    </a:ln>
+                  </pic:spPr>
+                </pic:pic>
+              </a:graphicData>
+            </a:graphic>
+          </wp:inline>
+        </w:drawing>
       </w:r>
     </w:p>
     <w:p>
@@ -2683,7 +2894,43 @@
         <w:rPr>
           <w:rFonts w:hint="eastAsia"/>
         </w:rPr>
-        <w:t xml:space="preserve">稳健性：十个气象年与成本参数蒙特卡洛下的总降幅及</w:t>
+        <w:t xml:space="preserve">稳健性：(a)</w:t>
+      </w:r>
+      <w:r>
+        <w:t xml:space="preserve"> </w:t>
+      </w:r>
+      <w:r>
+        <w:rPr>
+          <w:rFonts w:hint="eastAsia"/>
+        </w:rPr>
+        <w:t xml:space="preserve">十个气象年（2015—2024</w:t>
+      </w:r>
+      <w:r>
+        <w:t xml:space="preserve"> </w:t>
+      </w:r>
+      <w:r>
+        <w:rPr>
+          <w:rFonts w:hint="eastAsia"/>
+        </w:rPr>
+        <w:t xml:space="preserve">年）与</w:t>
+      </w:r>
+      <w:r>
+        <w:t xml:space="preserve"> (b) </w:t>
+      </w:r>
+      <w:r>
+        <w:rPr>
+          <w:rFonts w:hint="eastAsia"/>
+        </w:rPr>
+        <w:t xml:space="preserve">成本参数蒙特卡洛下刚性到协调的总降幅，(c)</w:t>
+      </w:r>
+      <w:r>
+        <w:t xml:space="preserve"> </w:t>
+      </w:r>
+      <w:r>
+        <w:rPr>
+          <w:rFonts w:hint="eastAsia"/>
+        </w:rPr>
+        <w:t xml:space="preserve">十个气象年下</w:t>
       </w:r>
       <w:r>
         <w:t xml:space="preserve"> S1rt </w:t>
@@ -2692,11 +2939,129 @@
         <w:rPr>
           <w:rFonts w:hint="eastAsia"/>
         </w:rPr>
-        <w:t xml:space="preserve">与协调最优的差距（图文件：figures/submission/fig4_robustness.pdf）。</w:t>
-      </w:r>
-    </w:p>
-    <w:bookmarkEnd w:id="24"/>
-    <w:bookmarkEnd w:id="25"/>
+        <w:t xml:space="preserve">与协调最优的差距（孤岛，AI</w:t>
+      </w:r>
+      <w:r>
+        <w:t xml:space="preserve"> </w:t>
+      </w:r>
+      <w:r>
+        <w:rPr>
+          <w:rFonts w:hint="eastAsia"/>
+        </w:rPr>
+        <w:t xml:space="preserve">占峰荷</w:t>
+      </w:r>
+      <w:r>
+        <w:t xml:space="preserve"> </w:t>
+      </w:r>
+      <w:r>
+        <w:rPr>
+          <w:rFonts w:hint="eastAsia"/>
+        </w:rPr>
+        <w:t xml:space="preserve">10%）。箱线图中线为中位数，箱为四分位距，须为</w:t>
+      </w:r>
+      <w:r>
+        <w:t xml:space="preserve"> 1.5 </w:t>
+      </w:r>
+      <w:r>
+        <w:rPr>
+          <w:rFonts w:hint="eastAsia"/>
+        </w:rPr>
+        <w:t xml:space="preserve">倍四分位距，点为离群值。</w:t>
+      </w:r>
+    </w:p>
+    <w:p>
+      <w:pPr>
+        <w:pStyle w:val="BodyText"/>
+      </w:pPr>
+      <w:r>
+        <w:t xml:space="preserve">Fig. 3 Robustness across ten weather years and a cost-parameter Monte Carlo, and the S1rt gap to the coordinated optimum</w:t>
+      </w:r>
+    </w:p>
+    <w:p>
+      <w:pPr>
+        <w:pStyle w:val="BodyText"/>
+      </w:pPr>
+      <w:r>
+        <w:rPr>
+          <w:rFonts w:hint="eastAsia"/>
+          <w:b/>
+          <w:bCs/>
+        </w:rPr>
+        <w:t xml:space="preserve">附图</w:t>
+      </w:r>
+      <w:r>
+        <w:rPr>
+          <w:b/>
+          <w:bCs/>
+        </w:rPr>
+        <w:t xml:space="preserve"> 1</w:t>
+      </w:r>
+      <w:r>
+        <w:t xml:space="preserve"> </w:t>
+      </w:r>
+      <w:r>
+        <w:rPr>
+          <w:rFonts w:hint="eastAsia"/>
+        </w:rPr>
+        <w:t xml:space="preserve">服务约束与实测功率：(a)</w:t>
+      </w:r>
+      <w:r>
+        <w:t xml:space="preserve"> </w:t>
+      </w:r>
+      <w:r>
+        <w:rPr>
+          <w:rFonts w:hint="eastAsia"/>
+        </w:rPr>
+        <w:t xml:space="preserve">实测</w:t>
+      </w:r>
+      <w:r>
+        <w:t xml:space="preserve"> GPU </w:t>
+      </w:r>
+      <w:r>
+        <w:rPr>
+          <w:rFonts w:hint="eastAsia"/>
+        </w:rPr>
+        <w:t xml:space="preserve">功率—吞吐量档位；(b)</w:t>
+      </w:r>
+      <w:r>
+        <w:t xml:space="preserve"> </w:t>
+      </w:r>
+      <w:r>
+        <w:rPr>
+          <w:rFonts w:hint="eastAsia"/>
+        </w:rPr>
+        <w:t xml:space="preserve">三套生产轨迹的排队等待与运行时长分布；(c)</w:t>
+      </w:r>
+      <w:r>
+        <w:t xml:space="preserve"> MLPerf Training v4.0 </w:t>
+      </w:r>
+      <w:r>
+        <w:rPr>
+          <w:rFonts w:hint="eastAsia"/>
+        </w:rPr>
+        <w:t xml:space="preserve">节点功率（见英文稿图</w:t>
+      </w:r>
+      <w:r>
+        <w:t xml:space="preserve"> </w:t>
+      </w:r>
+      <w:r>
+        <w:rPr>
+          <w:rFonts w:hint="eastAsia"/>
+        </w:rPr>
+        <w:t xml:space="preserve">1，文件</w:t>
+      </w:r>
+      <w:r>
+        <w:t xml:space="preserve"> </w:t>
+      </w:r>
+      <w:r>
+        <w:rPr>
+          <w:rFonts w:hint="eastAsia"/>
+        </w:rPr>
+        <w:t xml:space="preserve">figures/submission/fig1_constraints_and_power.pdf）。</w:t>
+      </w:r>
+    </w:p>
+    <w:bookmarkEnd w:id="33"/>
+    <w:bookmarkEnd w:id="34"/>
     <w:sectPr>
       <w:footnotePr>
         <w:numRestart w:val="eachSect"/>

</xml_diff>

<commit_message>
Chinese manuscript: review fixes applied via generator (terminology, ref [11], intro relationship, section 3 wording, currency note, GB/T 7714 dates, Guizhou tariff year, hydro caveat)
Co-Authored-By: Claude Opus 5 <noreply@anthropic.com>
</commit_message>
<xml_diff>
--- a/outputs/research/manuscript/docx/中文投稿稿_v1.0.docx
+++ b/outputs/research/manuscript/docx/中文投稿稿_v1.0.docx
@@ -132,16 +132,7 @@
         <w:rPr>
           <w:rFonts w:hint="eastAsia"/>
         </w:rPr>
-        <w:t xml:space="preserve">年公开数据情景为对象，重点分析分时电价形状、事件型承诺合同与按系统边际成本形状定价三种信号对时间转移价值兑现的影响。结果表明：在孤岛情景下，系统协调相对刚性全速运行可降低</w:t>
-      </w:r>
-      <w:r>
-        <w:t xml:space="preserve"> AI </w:t>
-      </w:r>
-      <w:r>
-        <w:rPr>
-          <w:rFonts w:hint="eastAsia"/>
-        </w:rPr>
-        <w:t xml:space="preserve">负荷增量系统成本</w:t>
+        <w:t xml:space="preserve">年公开数据情景为对象，重点分析分时电价形状、事件型承诺合同与按系统边际成本形状定价三种信号对时间转移价值兑现的影响。结果表明：在孤岛情景下，系统协调相对刚性全速运行可降低算力负荷增量系统成本</w:t>
       </w:r>
       <w:r>
         <w:t xml:space="preserve"> </w:t>
@@ -284,7 +275,16 @@
         <w:rPr>
           <w:rFonts w:hint="eastAsia"/>
         </w:rPr>
-        <w:t xml:space="preserve">本文的贡献是在同一框架内分离这两类价值，并检验中国省级电力市场中三种价格信号对时间转移价值兑现的影响。本文与作者的英文稿[11]共享模型与数据基础；英文稿侧重价值分解与国际比较，本文侧重分时电价形状、承诺合同与连续价格的机制比较及其对中国省级市场设计的含义。全部结果为公开数据情景结果，证据层级与局限在第</w:t>
+        <w:t xml:space="preserve">本文的贡献是在同一框架内分离这两类价值，并检验中国省级电力市场中三种价格信号对时间转移价值兑现的影响。本文与作者的英文稿[11]共享模型、数据以及甘肃、江苏、贵州三省六种情景（S0、S0e、S1、S3、S1rt、S2）与机制比较（分时电价、事件合同、连续价格）的核心数值结果，不涉及跨国/跨地区比较；本文在共享结果基础上新增第</w:t>
+      </w:r>
+      <w:r>
+        <w:t xml:space="preserve"> 3 </w:t>
+      </w:r>
+      <w:r>
+        <w:rPr>
+          <w:rFonts w:hint="eastAsia"/>
+        </w:rPr>
+        <w:t xml:space="preserve">节，将其转化为对中国省级分时电价与算力负荷需求响应机制设计的政策含义。全部结果为公开数据情景结果，证据层级与局限在第</w:t>
       </w:r>
       <w:r>
         <w:t xml:space="preserve"> 1 </w:t>
@@ -695,16 +695,7 @@
         <w:rPr>
           <w:rFonts w:hint="eastAsia"/>
         </w:rPr>
-        <w:t xml:space="preserve">且周期闭合的储能、机组可用率曲线、可选最小出力约束以及非</w:t>
-      </w:r>
-      <w:r>
-        <w:t xml:space="preserve"> AI </w:t>
-      </w:r>
-      <w:r>
-        <w:rPr>
-          <w:rFonts w:hint="eastAsia"/>
-        </w:rPr>
-        <w:t xml:space="preserve">负荷零缺电约束。投资成本按</w:t>
+        <w:t xml:space="preserve">且周期闭合的储能、机组可用率曲线、可选最小出力约束以及非算力负荷零缺电约束。投资成本按</w:t>
       </w:r>
       <w:r>
         <w:t xml:space="preserve"> 5% </w:t>
@@ -713,7 +704,16 @@
         <w:rPr>
           <w:rFonts w:hint="eastAsia"/>
         </w:rPr>
-        <w:t xml:space="preserve">折现率年化并折算到周。模型通过</w:t>
+        <w:t xml:space="preserve">折现率年化并折算到周。成本数据沿用</w:t>
+      </w:r>
+      <w:r>
+        <w:t xml:space="preserve"> PyPSA-China </w:t>
+      </w:r>
+      <w:r>
+        <w:rPr>
+          <w:rFonts w:hint="eastAsia"/>
+        </w:rPr>
+        <w:t xml:space="preserve">模型档案的欧元计价成本表[16]，未做汇率折算为人民币。模型通过</w:t>
       </w:r>
       <w:r>
         <w:t xml:space="preserve"> 118 </w:t>
@@ -1001,7 +1001,34 @@
         <w:rPr>
           <w:rFonts w:hint="eastAsia"/>
         </w:rPr>
-        <w:t xml:space="preserve">号）。电价水平统一取煤电边际成本的</w:t>
+        <w:t xml:space="preserve">号；因未获得</w:t>
+      </w:r>
+      <w:r>
+        <w:t xml:space="preserve"> 2020 </w:t>
+      </w:r>
+      <w:r>
+        <w:rPr>
+          <w:rFonts w:hint="eastAsia"/>
+        </w:rPr>
+        <w:t xml:space="preserve">年贵州分时电价官方文件，以此</w:t>
+      </w:r>
+      <w:r>
+        <w:t xml:space="preserve"> 2023 </w:t>
+      </w:r>
+      <w:r>
+        <w:rPr>
+          <w:rFonts w:hint="eastAsia"/>
+        </w:rPr>
+        <w:t xml:space="preserve">年文件形状替代，年份错配见第</w:t>
+      </w:r>
+      <w:r>
+        <w:t xml:space="preserve"> 4 </w:t>
+      </w:r>
+      <w:r>
+        <w:rPr>
+          <w:rFonts w:hint="eastAsia"/>
+        </w:rPr>
+        <w:t xml:space="preserve">节）。电价水平统一取煤电边际成本的</w:t>
       </w:r>
       <w:r>
         <w:t xml:space="preserve"> 1.5 </w:t>
@@ -1348,16 +1375,7 @@
         <w:rPr>
           <w:rFonts w:hint="eastAsia"/>
         </w:rPr>
-        <w:t xml:space="preserve">在孤岛情景、AI</w:t>
-      </w:r>
-      <w:r>
-        <w:t xml:space="preserve"> </w:t>
-      </w:r>
-      <w:r>
-        <w:rPr>
-          <w:rFonts w:hint="eastAsia"/>
-        </w:rPr>
-        <w:t xml:space="preserve">负荷占</w:t>
+        <w:t xml:space="preserve">在孤岛情景、算力负荷占</w:t>
       </w:r>
       <w:r>
         <w:t xml:space="preserve"> 2030 </w:t>
@@ -1438,16 +1456,7 @@
         <w:rPr>
           <w:rFonts w:hint="eastAsia"/>
         </w:rPr>
-        <w:t xml:space="preserve">0.4%～4.4%。转移价值在容量紧缺时最大：江苏</w:t>
-      </w:r>
-      <w:r>
-        <w:t xml:space="preserve"> AI </w:t>
-      </w:r>
-      <w:r>
-        <w:rPr>
-          <w:rFonts w:hint="eastAsia"/>
-        </w:rPr>
-        <w:t xml:space="preserve">占峰荷</w:t>
+        <w:t xml:space="preserve">0.4%～4.4%。转移价值在容量紧缺时最大：江苏算力负荷占峰荷</w:t>
       </w:r>
       <w:r>
         <w:t xml:space="preserve"> </w:t>
@@ -1648,16 +1657,7 @@
         <w:rPr>
           <w:rFonts w:hint="eastAsia"/>
         </w:rPr>
-        <w:t xml:space="preserve">11:00–17:00）与模型系统的富余时段不重合，负荷被引导到对企业便宜、对系统并不便宜的小时。十个气象年下，该份额在江苏</w:t>
-      </w:r>
-      <w:r>
-        <w:t xml:space="preserve"> </w:t>
-      </w:r>
-      <w:r>
-        <w:rPr>
-          <w:rFonts w:hint="eastAsia"/>
-        </w:rPr>
-        <w:t xml:space="preserve">全部为负，在甘肃</w:t>
+        <w:t xml:space="preserve">11:00–17:00）与模型系统的富余时段不重合，负荷被引导到对企业便宜、对系统并不便宜的小时。十个气象年下，该份额在江苏全部为负，在甘肃</w:t>
       </w:r>
       <w:r>
         <w:t xml:space="preserve"> 10 </w:t>
@@ -1675,16 +1675,7 @@
         <w:rPr>
           <w:rFonts w:hint="eastAsia"/>
         </w:rPr>
-        <w:t xml:space="preserve">年为负，在贵州</w:t>
-      </w:r>
-      <w:r>
-        <w:t xml:space="preserve"> </w:t>
-      </w:r>
-      <w:r>
-        <w:rPr>
-          <w:rFonts w:hint="eastAsia"/>
-        </w:rPr>
-        <w:t xml:space="preserve">全部为正。</w:t>
+        <w:t xml:space="preserve">年为负，在贵州全部为正。</w:t>
       </w:r>
     </w:p>
     <w:bookmarkEnd w:id="16"/>
@@ -1954,16 +1945,7 @@
         <w:rPr>
           <w:rFonts w:hint="eastAsia"/>
         </w:rPr>
-        <w:t xml:space="preserve">十个气象年下，孤岛、AI</w:t>
-      </w:r>
-      <w:r>
-        <w:t xml:space="preserve"> </w:t>
-      </w:r>
-      <w:r>
-        <w:rPr>
-          <w:rFonts w:hint="eastAsia"/>
-        </w:rPr>
-        <w:t xml:space="preserve">占峰荷</w:t>
+        <w:t xml:space="preserve">十个气象年下，孤岛、算力负荷占峰荷</w:t>
       </w:r>
       <w:r>
         <w:t xml:space="preserve"> 10% </w:t>
@@ -2126,7 +2108,52 @@
         <w:rPr>
           <w:rFonts w:hint="eastAsia"/>
         </w:rPr>
-        <w:t xml:space="preserve">（1）近期最大且无需新机制的收益来自高效档位运行：只要期限允许延长运行时间，企业在本文检验的两种电价形状下都会采用，政策上应确保算力项目的电力接入与电价不惩罚这种运行方式。（2）时间转移的价值取决于本省是否存在零边际成本或容量紧缺小时，省间交换充分时价值很小；把算力负荷当作大规模转移资源的预期应以本省系统结构为前提。（3）现行分时电价的峰谷时段来源于传统负荷曲线，与高比例新能源系统的富余时段错位，会把算力负荷引导到错误的小时；在现货市场省份，让参与市场的算力用户直接面对逐时出清价格形状，比在目录电价上叠加需求响应合同更有效。（4）事件型需求响应合同依赖基线，对可自由调度的算力负荷尤其容易被操纵；按计量电量的连续价格结算不存在这一问题。（5）实时推理受秒级服务约束[22]，本文未将其视为可转移负荷，其响应需要另行研究。</w:t>
+        <w:t xml:space="preserve">（1）近期最大且无需新机制的收益来自高效档位运行：只要期限允许延长运行时间，企业在本文检验的两种电价形状下都会采用，政策上应确保算力项目的电力接入与电价不惩罚这种运行方式。（2）时间转移的价值取决于本省是否存在零边际成本或容量紧缺小时，省间交换充分时价值很小；把算力负荷当作大规模转移资源的预期应以本省系统结构为前提。（3）现行分时电价的峰谷时段来源于传统负荷曲线，与高比例新能源系统的富余时段错位，会把算力负荷引导到错误的小时；在现货市场省份，若逐时出清价格能反映系统边际成本形状，本文构造的</w:t>
+      </w:r>
+      <w:r>
+        <w:t xml:space="preserve"> S1rt </w:t>
+      </w:r>
+      <w:r>
+        <w:rPr>
+          <w:rFonts w:hint="eastAsia"/>
+        </w:rPr>
+        <w:t xml:space="preserve">情景（取协调解事后对偶价格，见</w:t>
+      </w:r>
+      <w:r>
+        <w:t xml:space="preserve"> 2.4 </w:t>
+      </w:r>
+      <w:r>
+        <w:rPr>
+          <w:rFonts w:hint="eastAsia"/>
+        </w:rPr>
+        <w:t xml:space="preserve">节）显示其回收转移价值的效果优于在目录电价上叠加事件型合同；但</w:t>
+      </w:r>
+      <w:r>
+        <w:t xml:space="preserve"> S1rt </w:t>
+      </w:r>
+      <w:r>
+        <w:rPr>
+          <w:rFonts w:hint="eastAsia"/>
+        </w:rPr>
+        <w:t xml:space="preserve">的近最优性由构造保证，模型未刻画预测博弈与大负荷对价格的反馈，这一结论能否推广到真实现货市场机制设计仍有待检验。（4）事件型需求响应合同依赖基线；本文结果显示，可自由调度的算力负荷存在可观的基线操纵空间（江苏、贵州事件小时的虚增分别达</w:t>
+      </w:r>
+      <w:r>
+        <w:t xml:space="preserve"> 3,709 MW </w:t>
+      </w:r>
+      <w:r>
+        <w:rPr>
+          <w:rFonts w:hint="eastAsia"/>
+        </w:rPr>
+        <w:t xml:space="preserve">与</w:t>
+      </w:r>
+      <w:r>
+        <w:t xml:space="preserve"> 690 </w:t>
+      </w:r>
+      <w:r>
+        <w:rPr>
+          <w:rFonts w:hint="eastAsia"/>
+        </w:rPr>
+        <w:t xml:space="preserve">MW），但本文未与其他可调度负荷类型的基线操纵风险作比较；按计量电量的连续价格结算不存在这一问题。（5）实时推理受秒级服务约束[22]，本文未将其视为可转移负荷，其响应需要另行研究。</w:t>
       </w:r>
     </w:p>
     <w:bookmarkEnd w:id="21"/>
@@ -2162,7 +2189,34 @@
         <w:rPr>
           <w:rFonts w:hint="eastAsia"/>
         </w:rPr>
-        <w:t xml:space="preserve">的大型水库；煤电承诺为启发式并在各情景固定；未建模切换、检查点与冷却开销、任务迁移与非预见控制；只检验了一种事件规则；电价水平为假设。这些因素影响数值大小，不改变档位效应占主导、现行电价形状使转移多为负价值、边际成本形状价格回收大部分转移价值的定性结论。</w:t>
+        <w:t xml:space="preserve">的大型水库；这一简化可能高估水电的小时可调度性，并可能影响贵州的稀缺程度与转移价值结果，第</w:t>
+      </w:r>
+      <w:r>
+        <w:t xml:space="preserve"> 2、3 </w:t>
+      </w:r>
+      <w:r>
+        <w:rPr>
+          <w:rFonts w:hint="eastAsia"/>
+        </w:rPr>
+        <w:t xml:space="preserve">节涉及贵州的结论应据此审慎解读；煤电承诺为启发式并在各情景固定；未建模切换、检查点与冷却开销、任务迁移与非预见控制；贵州分时电价形状取自</w:t>
+      </w:r>
+      <w:r>
+        <w:t xml:space="preserve"> 2023 </w:t>
+      </w:r>
+      <w:r>
+        <w:rPr>
+          <w:rFonts w:hint="eastAsia"/>
+        </w:rPr>
+        <w:t xml:space="preserve">年文件（未获得</w:t>
+      </w:r>
+      <w:r>
+        <w:t xml:space="preserve"> 2020 </w:t>
+      </w:r>
+      <w:r>
+        <w:rPr>
+          <w:rFonts w:hint="eastAsia"/>
+        </w:rPr>
+        <w:t xml:space="preserve">年官方文件），存在年份错配；只检验了一种事件规则；电价水平为假设。这些因素影响数值大小，不改变档位效应占主导、现行电价形状使转移多为负价值、边际成本形状价格回收大部分转移价值的定性结论。</w:t>
       </w:r>
     </w:p>
     <w:bookmarkEnd w:id="22"/>
@@ -2314,41 +2368,53 @@
         <w:t xml:space="preserve">八枢纽激发数据新活力[EB/OL].</w:t>
       </w:r>
       <w:r>
-        <w:t xml:space="preserve"> (2022-03-21). https://www.ndrc.gov.cn/fzggw/jgsj/gjss/sjdt/202203/t20220321_1319862.html.</w:t>
-      </w:r>
-      <w:r>
-        <w:t xml:space="preserve"> </w:t>
-      </w:r>
-      <w:r>
-        <w:t xml:space="preserve">[2] Colangelo P, et al. AI data centres as grid-interactive assets[J]. Nature Energy, 2026, 11: 254-261.</w:t>
-      </w:r>
-      <w:r>
-        <w:t xml:space="preserve"> </w:t>
-      </w:r>
+        <w:t xml:space="preserve"> (2022-03-21)[2026-09-17]. https://www.ndrc.gov.cn/fzggw/jgsj/gjss/sjdt/202203/t20220321_1319862.html.</w:t>
+      </w:r>
+    </w:p>
+    <w:p>
+      <w:pPr>
+        <w:pStyle w:val="BodyText"/>
+      </w:pPr>
+      <w:r>
+        <w:t xml:space="preserve">[2] Colangelo P, Coskun A K, Megrue J, et al. AI data centres as grid-interactive assets[J]. Nature Energy, 2026, 11: 254-261.</w:t>
+      </w:r>
+    </w:p>
+    <w:p>
+      <w:pPr>
+        <w:pStyle w:val="BodyText"/>
+      </w:pPr>
       <w:r>
         <w:t xml:space="preserve">[3] Zhang W, Zavala V M. Remunerating space–time, load-shifting flexibility from data centers in electricity markets[J]. Applied Energy, 2022, 326: 119930.</w:t>
       </w:r>
-      <w:r>
-        <w:t xml:space="preserve"> </w:t>
-      </w:r>
+    </w:p>
+    <w:p>
+      <w:pPr>
+        <w:pStyle w:val="BodyText"/>
+      </w:pPr>
       <w:r>
         <w:t xml:space="preserve">[4] Zheng J, Chien A A, Suh S. Mitigating curtailment and carbon emissions through load migration between data centers[J]. Joule, 2020, 4(10): 2208-2222.</w:t>
       </w:r>
-      <w:r>
-        <w:t xml:space="preserve"> </w:t>
-      </w:r>
+    </w:p>
+    <w:p>
+      <w:pPr>
+        <w:pStyle w:val="BodyText"/>
+      </w:pPr>
       <w:r>
         <w:t xml:space="preserve">[5] Fridgen G, Keller R, Thimmel M, et al. Shifting load through space: the economics of spatial demand side management using distributed data centers[J]. Energy Policy, 2017, 109: 400-413.</w:t>
       </w:r>
-      <w:r>
-        <w:t xml:space="preserve"> </w:t>
-      </w:r>
+    </w:p>
+    <w:p>
+      <w:pPr>
+        <w:pStyle w:val="BodyText"/>
+      </w:pPr>
       <w:r>
         <w:t xml:space="preserve">[6] Senga J R L, Wang S, Knittel C R. Flexible data centers reduce power system costs but can increase emissions[J]. iScience, 2026, 29(7): 116497.</w:t>
       </w:r>
-      <w:r>
-        <w:t xml:space="preserve"> </w:t>
-      </w:r>
+    </w:p>
+    <w:p>
+      <w:pPr>
+        <w:pStyle w:val="BodyText"/>
+      </w:pPr>
       <w:r>
         <w:t xml:space="preserve">[7] Zhang Y, Li H, Wang S. Decarbonizing data centers through regional bits migration: a comprehensive assessment of China’s</w:t>
       </w:r>
@@ -2364,78 +2430,100 @@
       <w:r>
         <w:t xml:space="preserve">initiative and its global implications[J]. Applied Energy, 2025, 392: 126020.</w:t>
       </w:r>
-      <w:r>
-        <w:t xml:space="preserve"> </w:t>
-      </w:r>
-      <w:r>
-        <w:t xml:space="preserve">[8] Dunlap C. Quantifying AI data center flexibility as a resource adequacy asset[EB/OL]. Research Square, 2026. https://www.researchsquare.com/article/rs-9829457/v1.</w:t>
-      </w:r>
-      <w:r>
-        <w:t xml:space="preserve"> </w:t>
-      </w:r>
+    </w:p>
+    <w:p>
+      <w:pPr>
+        <w:pStyle w:val="BodyText"/>
+      </w:pPr>
+      <w:r>
+        <w:t xml:space="preserve">[8] Dunlap C. Quantifying AI data center flexibility as a resource adequacy asset[EB/OL]. Research Square, 2026[2026-09-17]. https://www.researchsquare.com/article/rs-9829457/v1.</w:t>
+      </w:r>
+    </w:p>
+    <w:p>
+      <w:pPr>
+        <w:pStyle w:val="BodyText"/>
+      </w:pPr>
       <w:r>
         <w:t xml:space="preserve">[9] Birahim S A. A net-grid-benefit test for interconnecting AI data centres[J]. npj Environmental Social Sciences, 2026, 1: 8.</w:t>
       </w:r>
-      <w:r>
-        <w:t xml:space="preserve"> </w:t>
-      </w:r>
+    </w:p>
+    <w:p>
+      <w:pPr>
+        <w:pStyle w:val="BodyText"/>
+      </w:pPr>
       <w:r>
         <w:t xml:space="preserve">[10] Chen Y, Zheng X. To defer or to shift? The role of AI data center flexibility on grid interconnection[C]//Proceedings of the 2026 ACM Sustainability Week. New York: ACM, 2026: 322-327.</w:t>
       </w:r>
-      <w:r>
-        <w:t xml:space="preserve"> </w:t>
-      </w:r>
-      <w:r>
-        <w:t xml:space="preserve">[11] Wei W, Liu L. Efficient modes, not load shifting, deliver most of the grid value of flexible AI computing[J]. </w:t>
-      </w:r>
-      <w:r>
-        <w:rPr>
-          <w:rFonts w:hint="eastAsia"/>
-        </w:rPr>
-        <w:t xml:space="preserve">投稿中,</w:t>
+    </w:p>
+    <w:p>
+      <w:pPr>
+        <w:pStyle w:val="BodyText"/>
+      </w:pPr>
+      <w:r>
+        <w:t xml:space="preserve">[11] Wei W, Liu L. Efficient modes, not load shifting, deliver most of the grid value of flexible AI computing. </w:t>
+      </w:r>
+      <w:r>
+        <w:rPr>
+          <w:rFonts w:hint="eastAsia"/>
+        </w:rPr>
+        <w:t xml:space="preserve">待发表,</w:t>
       </w:r>
       <w:r>
         <w:t xml:space="preserve"> 2026.</w:t>
       </w:r>
-      <w:r>
-        <w:t xml:space="preserve"> </w:t>
-      </w:r>
-      <w:r>
-        <w:t xml:space="preserve">[12] MLCommons. MLPerf Training v4.0 results, including power submissions[EB/OL]. 2024. https://github.com/mlcommons/training_results_v4.0.</w:t>
-      </w:r>
-      <w:r>
-        <w:t xml:space="preserve"> </w:t>
-      </w:r>
+    </w:p>
+    <w:p>
+      <w:pPr>
+        <w:pStyle w:val="BodyText"/>
+      </w:pPr>
+      <w:r>
+        <w:t xml:space="preserve">[12] MLCommons. MLPerf Training v4.0 results, including power submissions[EB/OL]. 2024[2026-09-17]. https://github.com/mlcommons/training_results_v4.0.</w:t>
+      </w:r>
+    </w:p>
+    <w:p>
+      <w:pPr>
+        <w:pStyle w:val="BodyText"/>
+      </w:pPr>
       <w:r>
         <w:t xml:space="preserve">[13] Hu Q, Sun P, Yan S, et al. Characterization and prediction of deep learning workloads in large-scale GPU datacenters[C]//Proceedings of the International Conference for High Performance Computing, Networking, Storage and Analysis. New York: ACM, 2021: 1-15.</w:t>
       </w:r>
-      <w:r>
-        <w:t xml:space="preserve"> </w:t>
-      </w:r>
+    </w:p>
+    <w:p>
+      <w:pPr>
+        <w:pStyle w:val="BodyText"/>
+      </w:pPr>
       <w:r>
         <w:t xml:space="preserve">[14] Weng Q, Xiao W, Yu Y, et al. MLaaS in the wild: workload analysis and scheduling in large-scale heterogeneous GPU clusters[C]//Proceedings of the 19th USENIX Symposium on Networked Systems Design and Implementation. Berkeley: USENIX, 2022: 945-960.</w:t>
       </w:r>
-      <w:r>
-        <w:t xml:space="preserve"> </w:t>
-      </w:r>
+    </w:p>
+    <w:p>
+      <w:pPr>
+        <w:pStyle w:val="BodyText"/>
+      </w:pPr>
       <w:r>
         <w:t xml:space="preserve">[15] Jeon M, Venkataraman S, Phanishayee A, et al. Analysis of large-scale multi-tenant GPU clusters for DNN training workloads[C]//Proceedings of the USENIX Annual Technical Conference. Berkeley: USENIX, 2019: 947-960.</w:t>
       </w:r>
-      <w:r>
-        <w:t xml:space="preserve"> </w:t>
-      </w:r>
-      <w:r>
-        <w:t xml:space="preserve">[16] Zhou X. PyPSA-China: V3.0[DS/OL]. Zenodo, 2024. https://doi.org/10.5281/zenodo.13987282.</w:t>
-      </w:r>
-      <w:r>
-        <w:t xml:space="preserve"> </w:t>
-      </w:r>
-      <w:r>
-        <w:t xml:space="preserve">[17] Wu H, Kan X. Hourly electric power load and transmission data at the provincial level in China[DS/OL]. Zenodo, 2023. https://doi.org/10.5281/zenodo.8322210.</w:t>
-      </w:r>
-      <w:r>
-        <w:t xml:space="preserve"> </w:t>
-      </w:r>
+    </w:p>
+    <w:p>
+      <w:pPr>
+        <w:pStyle w:val="BodyText"/>
+      </w:pPr>
+      <w:r>
+        <w:t xml:space="preserve">[16] Zhou X. PyPSA-China: V3.0[DS/OL]. Zenodo, 2024[2026-09-17]. https://doi.org/10.5281/zenodo.13987282.</w:t>
+      </w:r>
+    </w:p>
+    <w:p>
+      <w:pPr>
+        <w:pStyle w:val="BodyText"/>
+      </w:pPr>
+      <w:r>
+        <w:t xml:space="preserve">[17] Wu H, Kan X. Hourly electric power load and transmission data at the provincial level in China[DS/OL]. Zenodo, 2023[2026-09-17]. https://doi.org/10.5281/zenodo.8322210.</w:t>
+      </w:r>
+    </w:p>
+    <w:p>
+      <w:pPr>
+        <w:pStyle w:val="BodyText"/>
+      </w:pPr>
       <w:r>
         <w:t xml:space="preserve">[18] </w:t>
       </w:r>
@@ -2493,9 +2581,11 @@
       <w:r>
         <w:t xml:space="preserve"> 2021.</w:t>
       </w:r>
-      <w:r>
-        <w:t xml:space="preserve"> </w:t>
-      </w:r>
+    </w:p>
+    <w:p>
+      <w:pPr>
+        <w:pStyle w:val="BodyText"/>
+      </w:pPr>
       <w:r>
         <w:t xml:space="preserve">[19] Potsdam Institute for Climate Impact Research. Data bundle PyPSA-China-PIK: rasters and basic cutout, v1.1 </w:t>
       </w:r>
@@ -2533,23 +2623,29 @@
         <w:t xml:space="preserve">月中国子集)[DS/OL].</w:t>
       </w:r>
       <w:r>
-        <w:t xml:space="preserve"> Zenodo, 2025. https://doi.org/10.5281/zenodo.16810831.</w:t>
-      </w:r>
-      <w:r>
-        <w:t xml:space="preserve"> </w:t>
-      </w:r>
+        <w:t xml:space="preserve"> Zenodo, 2025[2026-09-17]. https://doi.org/10.5281/zenodo.16810831.</w:t>
+      </w:r>
+    </w:p>
+    <w:p>
+      <w:pPr>
+        <w:pStyle w:val="BodyText"/>
+      </w:pPr>
       <w:r>
         <w:t xml:space="preserve">[20] Hersbach H, Bell B, Berrisford P, et al. The ERA5 global reanalysis[J]. Quarterly Journal of the Royal Meteorological Society, 2020, 146(730): 1999-2049.</w:t>
       </w:r>
-      <w:r>
-        <w:t xml:space="preserve"> </w:t>
-      </w:r>
-      <w:r>
-        <w:t xml:space="preserve">[21] Zippenfenig P. Open-Meteo.com weather API[DS/OL]. Zenodo, 2024. https://doi.org/10.5281/zenodo.7970649.</w:t>
-      </w:r>
-      <w:r>
-        <w:t xml:space="preserve"> </w:t>
-      </w:r>
+    </w:p>
+    <w:p>
+      <w:pPr>
+        <w:pStyle w:val="BodyText"/>
+      </w:pPr>
+      <w:r>
+        <w:t xml:space="preserve">[21] Zippenfenig P. Open-Meteo.com weather API[DS/OL]. Zenodo, 2024[2026-09-17]. https://doi.org/10.5281/zenodo.7970649.</w:t>
+      </w:r>
+    </w:p>
+    <w:p>
+      <w:pPr>
+        <w:pStyle w:val="BodyText"/>
+      </w:pPr>
       <w:r>
         <w:t xml:space="preserve">[22] Stojkovic J, Zhang C, Goiri Í, et al. DynamoLLM: designing LLM inference clusters for performance and energy efficiency[C]//Proceedings of the IEEE International Symposium on High-Performance Computer Architecture. Piscataway: IEEE, 2025: 1348-1362.</w:t>
       </w:r>
@@ -2783,16 +2879,7 @@
         <w:rPr>
           <w:rFonts w:hint="eastAsia"/>
         </w:rPr>
-        <w:t xml:space="preserve">41%，AI</w:t>
-      </w:r>
-      <w:r>
-        <w:t xml:space="preserve"> </w:t>
-      </w:r>
-      <w:r>
-        <w:rPr>
-          <w:rFonts w:hint="eastAsia"/>
-        </w:rPr>
-        <w:t xml:space="preserve">负荷占</w:t>
+        <w:t xml:space="preserve">41%，算力负荷占</w:t>
       </w:r>
       <w:r>
         <w:t xml:space="preserve"> 2030 </w:t>
@@ -2939,16 +3026,7 @@
         <w:rPr>
           <w:rFonts w:hint="eastAsia"/>
         </w:rPr>
-        <w:t xml:space="preserve">与协调最优的差距（孤岛，AI</w:t>
-      </w:r>
-      <w:r>
-        <w:t xml:space="preserve"> </w:t>
-      </w:r>
-      <w:r>
-        <w:rPr>
-          <w:rFonts w:hint="eastAsia"/>
-        </w:rPr>
-        <w:t xml:space="preserve">占峰荷</w:t>
+        <w:t xml:space="preserve">与协调最优的差距（孤岛，算力负荷占峰荷</w:t>
       </w:r>
       <w:r>
         <w:t xml:space="preserve"> </w:t>

</xml_diff>

<commit_message>
Insert Zenodo DOI 10.5281/zenodo.22803801 (v1.0.1) into manuscripts, cover letter, CITATION.cff and README
Co-Authored-By: Claude Opus 5 <noreply@anthropic.com>
</commit_message>
<xml_diff>
--- a/outputs/research/manuscript/docx/中文投稿稿_v1.0.docx
+++ b/outputs/research/manuscript/docx/中文投稿稿_v1.0.docx
@@ -2292,7 +2292,34 @@
         <w:rPr>
           <w:rFonts w:hint="eastAsia"/>
         </w:rPr>
-        <w:t xml:space="preserve">全部输入为公开数据，来源、版本、校验值与许可见英文稿补充材料；代码与验证记录将在发表时公开并存档。</w:t>
+        <w:t xml:space="preserve">全部输入为公开数据，来源、版本、校验值与许可见英文稿补充材料；代码、审计与验证记录已公开于</w:t>
+      </w:r>
+      <w:r>
+        <w:t xml:space="preserve"> </w:t>
+      </w:r>
+      <w:r>
+        <w:rPr>
+          <w:rFonts w:hint="eastAsia"/>
+        </w:rPr>
+        <w:t xml:space="preserve">https://github.com/william19307/ai-grid-flexibility-research，并存档于</w:t>
+      </w:r>
+      <w:r>
+        <w:t xml:space="preserve"> </w:t>
+      </w:r>
+      <w:r>
+        <w:rPr>
+          <w:rFonts w:hint="eastAsia"/>
+        </w:rPr>
+        <w:t xml:space="preserve">Zenodo（DOI:</w:t>
+      </w:r>
+      <w:r>
+        <w:t xml:space="preserve"> </w:t>
+      </w:r>
+      <w:r>
+        <w:rPr>
+          <w:rFonts w:hint="eastAsia"/>
+        </w:rPr>
+        <w:t xml:space="preserve">10.5281/zenodo.22803801）。</w:t>
       </w:r>
     </w:p>
     <w:p>

</xml_diff>

<commit_message>
Submit to Nature Energy (NENERGY-26093649); SI v1.4 readable tables; ZH manuscript carries the ID
- Cover letter: state no prior editor discussion; note manuscript text is in the public repository
- SI v1.4 rebuilt by build_si.py: S7/S8 split into cost/metric/capacity sub-tables, S9/S10/S12
  transposed to metric rows, plain decimal numbers, column key added; S6 key '|' that broke the
  markdown table fixed. Values unchanged from v1.3 (cell-by-cell check). Submitted as landscape PDF.
- supplementary_data_1.xlsx: full-precision tables, one sheet each
- Chinese manuscript ref [11] and submission letter now cite Zenodo v1.0.3 and NENERGY-26093649
- RESEARCH_LOG stage 13, progress JSON and readiness checklist record the submission
- SI v1.3 moved to manuscript/archive

Co-Authored-By: Claude Opus 5 <noreply@anthropic.com>
</commit_message>
<xml_diff>
--- a/outputs/research/manuscript/docx/中文投稿稿_v1.0.docx
+++ b/outputs/research/manuscript/docx/中文投稿稿_v1.0.docx
@@ -2573,16 +2573,31 @@
         <w:pStyle w:val="BodyText"/>
       </w:pPr>
       <w:r>
-        <w:t xml:space="preserve">[11] Wei W, Liu L. Efficient modes, not load shifting, deliver most of the grid value of flexible AI computing. </w:t>
-      </w:r>
-      <w:r>
-        <w:rPr>
-          <w:rFonts w:hint="eastAsia"/>
-        </w:rPr>
-        <w:t xml:space="preserve">待发表,</w:t>
-      </w:r>
-      <w:r>
-        <w:t xml:space="preserve"> 2026.</w:t>
+        <w:t xml:space="preserve">[11] Wei W, Liu L. Efficient modes, not load shifting, deliver most of the grid value of flexible AI computing[Z/OL]. Zenodo, 2026[2026-09-17]. https://doi.org/10.5281/zenodo.22804268. </w:t>
+      </w:r>
+      <w:r>
+        <w:rPr>
+          <w:rFonts w:hint="eastAsia"/>
+        </w:rPr>
+        <w:t xml:space="preserve">已投稿</w:t>
+      </w:r>
+      <w:r>
+        <w:t xml:space="preserve"> Nature </w:t>
+      </w:r>
+      <w:r>
+        <w:rPr>
+          <w:rFonts w:hint="eastAsia"/>
+        </w:rPr>
+        <w:t xml:space="preserve">Energy，稿件编号</w:t>
+      </w:r>
+      <w:r>
+        <w:t xml:space="preserve"> </w:t>
+      </w:r>
+      <w:r>
+        <w:rPr>
+          <w:rFonts w:hint="eastAsia"/>
+        </w:rPr>
+        <w:t xml:space="preserve">NENERGY-26093649，审稿中.</w:t>
       </w:r>
     </w:p>
     <w:p>

</xml_diff>

<commit_message>
Chinese manuscript: conform to 中国电机工程学报 author guidelines
- One affiliation per author in the byline (company kept in the author bio), postcodes added
- Chinese abstract cut to 399 characters (journal band 300-400), same numbers and claims
- English title, pinyin author names, English affiliations, abstract and key words added
- Chinese-language references [1] and [18] given English renderings; [19] fully in English
- Submission letter discloses that the manuscript text is in the public research repository
  and explains the single-affiliation byline

Co-Authored-By: Claude Opus 5 <noreply@anthropic.com>
</commit_message>
<xml_diff>
--- a/outputs/research/manuscript/docx/中文投稿稿_v1.0.docx
+++ b/outputs/research/manuscript/docx/中文投稿稿_v1.0.docx
@@ -47,7 +47,7 @@
           <w:bCs/>
           <w:vertAlign w:val="superscript"/>
         </w:rPr>
-        <w:t xml:space="preserve">1,2</w:t>
+        <w:t xml:space="preserve">1</w:t>
       </w:r>
       <w:r>
         <w:rPr>
@@ -63,7 +63,7 @@
           <w:bCs/>
           <w:vertAlign w:val="superscript"/>
         </w:rPr>
-        <w:t xml:space="preserve">3</w:t>
+        <w:t xml:space="preserve">2</w:t>
       </w:r>
     </w:p>
     <w:p>
@@ -110,25 +110,16 @@
         <w:rPr>
           <w:rFonts w:hint="eastAsia"/>
         </w:rPr>
-        <w:t xml:space="preserve">利兹；2.</w:t>
-      </w:r>
-      <w:r>
-        <w:t xml:space="preserve"> </w:t>
-      </w:r>
-      <w:r>
-        <w:rPr>
-          <w:rFonts w:hint="eastAsia"/>
-        </w:rPr>
-        <w:t xml:space="preserve">空间计算（福建）科技有限公司，福建</w:t>
-      </w:r>
-      <w:r>
-        <w:t xml:space="preserve"> </w:t>
-      </w:r>
-      <w:r>
-        <w:rPr>
-          <w:rFonts w:hint="eastAsia"/>
-        </w:rPr>
-        <w:t xml:space="preserve">福州；3.</w:t>
+        <w:t xml:space="preserve">利兹</w:t>
+      </w:r>
+      <w:r>
+        <w:t xml:space="preserve"> LS2 </w:t>
+      </w:r>
+      <w:r>
+        <w:rPr>
+          <w:rFonts w:hint="eastAsia"/>
+        </w:rPr>
+        <w:t xml:space="preserve">9JT；2.</w:t>
       </w:r>
       <w:r>
         <w:t xml:space="preserve"> </w:t>
@@ -146,16 +137,25 @@
         <w:rPr>
           <w:rFonts w:hint="eastAsia"/>
         </w:rPr>
-        <w:t xml:space="preserve">公共管理学院，福建</w:t>
-      </w:r>
-      <w:r>
-        <w:t xml:space="preserve"> </w:t>
-      </w:r>
-      <w:r>
-        <w:rPr>
-          <w:rFonts w:hint="eastAsia"/>
-        </w:rPr>
-        <w:t xml:space="preserve">福州）</w:t>
+        <w:t xml:space="preserve">公共管理学院，福建省</w:t>
+      </w:r>
+      <w:r>
+        <w:t xml:space="preserve"> </w:t>
+      </w:r>
+      <w:r>
+        <w:rPr>
+          <w:rFonts w:hint="eastAsia"/>
+        </w:rPr>
+        <w:t xml:space="preserve">福州市</w:t>
+      </w:r>
+      <w:r>
+        <w:t xml:space="preserve"> </w:t>
+      </w:r>
+      <w:r>
+        <w:rPr>
+          <w:rFonts w:hint="eastAsia"/>
+        </w:rPr>
+        <w:t xml:space="preserve">350117）</w:t>
       </w:r>
     </w:p>
     <w:p>
@@ -208,7 +208,7 @@
         <w:rPr>
           <w:rFonts w:hint="eastAsia"/>
         </w:rPr>
-        <w:t xml:space="preserve">人工智能（AI）算力负荷既可通过降低运行档位减少单位工作量的能耗，也可在时间上转移执行，两者对电力系统的价值来源不同。本文在同等计算工作量与同等供电可靠性条件下，将实测图形处理器（GPU）功率档位、生产集群作业轨迹、电力投资—运行联合规划模型与企业在电价和合同下的行为纳入同一框架，以甘肃、江苏、贵州三省</w:t>
+        <w:t xml:space="preserve">人工智能（AI）算力负荷既可降档运行以减少单位工作量能耗，也可在时间上转移，二者的系统价值来源不同。本文在同等工作量与可靠性下，将实测图形处理器（GPU）功率档位、作业轨迹、投资—运行联合规划模型与企业行为纳入同一框架，以甘肃、江苏、贵州</w:t>
       </w:r>
       <w:r>
         <w:t xml:space="preserve"> 2030 </w:t>
@@ -217,43 +217,43 @@
         <w:rPr>
           <w:rFonts w:hint="eastAsia"/>
         </w:rPr>
-        <w:t xml:space="preserve">年公开数据情景为对象，重点分析分时电价形状、事件型承诺合同与按系统边际成本形状定价三种信号对时间转移价值兑现的影响。结果表明：在孤岛情景下，系统协调相对刚性全速运行可降低算力负荷增量系统成本</w:t>
-      </w:r>
-      <w:r>
-        <w:t xml:space="preserve"> </w:t>
-      </w:r>
-      <w:r>
-        <w:rPr>
-          <w:rFonts w:hint="eastAsia"/>
-        </w:rPr>
-        <w:t xml:space="preserve">13.6%～28.5%，其中高效档位不作任何转移即可获得绝大部分；时间转移的剩余价值仅为增量成本的</w:t>
-      </w:r>
-      <w:r>
-        <w:t xml:space="preserve"> </w:t>
-      </w:r>
-      <w:r>
-        <w:rPr>
-          <w:rFonts w:hint="eastAsia"/>
-        </w:rPr>
-        <w:t xml:space="preserve">0.1%～4.4%，有省间交换时低于</w:t>
-      </w:r>
-      <w:r>
-        <w:t xml:space="preserve"> </w:t>
-      </w:r>
-      <w:r>
-        <w:rPr>
-          <w:rFonts w:hint="eastAsia"/>
-        </w:rPr>
-        <w:t xml:space="preserve">0.4%，仅在容量紧缺时可避免吉瓦级燃气机组投资。企业按现行分时电价形状优化时，时间转移在</w:t>
-      </w:r>
-      <w:r>
-        <w:t xml:space="preserve"> 18 </w:t>
-      </w:r>
-      <w:r>
-        <w:rPr>
-          <w:rFonts w:hint="eastAsia"/>
-        </w:rPr>
-        <w:t xml:space="preserve">组孤岛设定中的</w:t>
+        <w:t xml:space="preserve">年公开数据情景分析分时电价形状、事件型合同与按系统边际成本定价对时间转移价值兑现的影响。孤岛情景下系统协调相对刚性运行可降低算力负荷增量系统成本</w:t>
+      </w:r>
+      <w:r>
+        <w:t xml:space="preserve"> </w:t>
+      </w:r>
+      <w:r>
+        <w:rPr>
+          <w:rFonts w:hint="eastAsia"/>
+        </w:rPr>
+        <w:t xml:space="preserve">13.6%～28.5%，高效档位不作转移即可获得绝大部分；时间转移剩余价值仅为增量成本的</w:t>
+      </w:r>
+      <w:r>
+        <w:t xml:space="preserve"> </w:t>
+      </w:r>
+      <w:r>
+        <w:rPr>
+          <w:rFonts w:hint="eastAsia"/>
+        </w:rPr>
+        <w:t xml:space="preserve">0.1%～4.4%，省间交换时低于</w:t>
+      </w:r>
+      <w:r>
+        <w:t xml:space="preserve"> </w:t>
+      </w:r>
+      <w:r>
+        <w:rPr>
+          <w:rFonts w:hint="eastAsia"/>
+        </w:rPr>
+        <w:t xml:space="preserve">0.4%。按现行分时电价优化时，18</w:t>
+      </w:r>
+      <w:r>
+        <w:t xml:space="preserve"> </w:t>
+      </w:r>
+      <w:r>
+        <w:rPr>
+          <w:rFonts w:hint="eastAsia"/>
+        </w:rPr>
+        <w:t xml:space="preserve">组孤岛设定中</w:t>
       </w:r>
       <w:r>
         <w:t xml:space="preserve"> 14 </w:t>
@@ -262,7 +262,7 @@
         <w:rPr>
           <w:rFonts w:hint="eastAsia"/>
         </w:rPr>
-        <w:t xml:space="preserve">组产生负价值，原因是电价低谷时段与系统富余时段错位；叠加事件型承诺合同不能改善并暴露于基线操纵；按系统边际成本形状的逐时价格可在除</w:t>
+        <w:t xml:space="preserve">组的时间转移为负价值；叠加事件型合同不能改善且暴露于基线操纵；按系统边际成本形状定价在除</w:t>
       </w:r>
       <w:r>
         <w:t xml:space="preserve"> 1 </w:t>
@@ -271,16 +271,16 @@
         <w:rPr>
           <w:rFonts w:hint="eastAsia"/>
         </w:rPr>
-        <w:t xml:space="preserve">组以外的全部设定中回收转移价值，总成本与协调最优的差距不超过</w:t>
-      </w:r>
-      <w:r>
-        <w:t xml:space="preserve"> </w:t>
-      </w:r>
-      <w:r>
-        <w:rPr>
-          <w:rFonts w:hint="eastAsia"/>
-        </w:rPr>
-        <w:t xml:space="preserve">2.6%。结论对中国省级分时电价与算力负荷需求响应机制设计具有直接含义：近期应优先释放高效档位价值，时间转移需要形状正确的价格而非叠加在现行电价上的合同。</w:t>
+        <w:t xml:space="preserve">组外的全部设定回收转移价值，与协调最优差距不超过</w:t>
+      </w:r>
+      <w:r>
+        <w:t xml:space="preserve"> </w:t>
+      </w:r>
+      <w:r>
+        <w:rPr>
+          <w:rFonts w:hint="eastAsia"/>
+        </w:rPr>
+        <w:t xml:space="preserve">2.6%。近期应优先释放档位价值，时间转移需要形状正确的价格而非叠加合同。</w:t>
       </w:r>
     </w:p>
     <w:p>
@@ -303,6 +303,85 @@
           <w:rFonts w:hint="eastAsia"/>
         </w:rPr>
         <w:t xml:space="preserve">算力负荷；数据中心；需求响应；分时电价；负荷灵活性；电力系统规划；机制设计</w:t>
+      </w:r>
+    </w:p>
+    <w:p>
+      <w:pPr>
+        <w:pStyle w:val="BodyText"/>
+      </w:pPr>
+      <w:r>
+        <w:rPr>
+          <w:b/>
+          <w:bCs/>
+        </w:rPr>
+        <w:t xml:space="preserve">Shape of Time-of-Use Tariffs and the Value of Temporal Shifting of AI Computing Load: A Scenario Analysis for Chinese Provincial Power Systems</w:t>
+      </w:r>
+    </w:p>
+    <w:p>
+      <w:pPr>
+        <w:pStyle w:val="BodyText"/>
+      </w:pPr>
+      <w:r>
+        <w:t xml:space="preserve">WEI Hong (William Wei)</w:t>
+      </w:r>
+      <w:r>
+        <w:rPr>
+          <w:vertAlign w:val="superscript"/>
+        </w:rPr>
+        <w:t xml:space="preserve">1</w:t>
+      </w:r>
+      <w:r>
+        <w:t xml:space="preserve">, LIU Lanlan</w:t>
+      </w:r>
+      <w:r>
+        <w:rPr>
+          <w:vertAlign w:val="superscript"/>
+        </w:rPr>
+        <w:t xml:space="preserve">2</w:t>
+      </w:r>
+    </w:p>
+    <w:p>
+      <w:pPr>
+        <w:pStyle w:val="BodyText"/>
+      </w:pPr>
+      <w:r>
+        <w:t xml:space="preserve">(1. School of Computer Science, Faculty of Engineering and Physical Sciences, University of Leeds, Leeds LS2 9JT, UK; 2. School of Public Administration, Fujian Normal University, Fuzhou 350117, Fujian Province, China)</w:t>
+      </w:r>
+    </w:p>
+    <w:p>
+      <w:pPr>
+        <w:pStyle w:val="BodyText"/>
+      </w:pPr>
+      <w:r>
+        <w:rPr>
+          <w:b/>
+          <w:bCs/>
+        </w:rPr>
+        <w:t xml:space="preserve">ABSTRACT:</w:t>
+      </w:r>
+      <w:r>
+        <w:t xml:space="preserve"> </w:t>
+      </w:r>
+      <w:r>
+        <w:t xml:space="preserve">Artificial intelligence (AI) computing load can lower the energy per unit of work by running at lower power modes, or shift execution in time; the two levers create power-system value in different ways. For the same computing work and the same supply reliability, this paper combines measured graphics processing unit (GPU) power modes, production-cluster job traces, a joint investment–dispatch planning model and firm behaviour under tariffs and contracts in one framework, applied to a 2030 public-data scenario for Gansu, Jiangsu and Guizhou, and analyses how the shape of time-of-use tariffs, an event-based commitment contract and a price shaped like the system marginal cost affect the realisation of shifting value. In islanded provinces, system coordination lowers the incremental system cost of the AI load by 13.6%–28.5% relative to rigid operation, and efficient modes without any shifting deliver almost all of it; the remaining shifting value is only 0.1%–4.4% of the incremental cost, and below 0.4% with interprovincial exchange. A firm optimising against the current time-of-use tariff shapes gives shifting a negative value in 14 of 18 islanded settings; an event-based commitment contract layered on the tariff does not repair this and is exposed to baseline manipulation; an hourly price shaped like the system marginal cost recovers shifting value in all but 1 setting and keeps total cost within 2.6% of the coordinated optimum. In the near term, the value of efficient modes should be released first; temporal shifting requires prices of the right shape rather than contracts layered on today’s tariffs.</w:t>
+      </w:r>
+    </w:p>
+    <w:p>
+      <w:pPr>
+        <w:pStyle w:val="BodyText"/>
+      </w:pPr>
+      <w:r>
+        <w:rPr>
+          <w:b/>
+          <w:bCs/>
+        </w:rPr>
+        <w:t xml:space="preserve">KEY WORDS:</w:t>
+      </w:r>
+      <w:r>
+        <w:t xml:space="preserve"> </w:t>
+      </w:r>
+      <w:r>
+        <w:t xml:space="preserve">AI computing load; data centre; demand response; time-of-use tariff; load flexibility; power system planning; mechanism design</w:t>
       </w:r>
     </w:p>
     <w:bookmarkStart w:id="9" w:name="引言"/>
@@ -2483,6 +2562,24 @@
       <w:r>
         <w:t xml:space="preserve"> (2022-03-21)[2026-09-17]. https://www.ndrc.gov.cn/fzggw/jgsj/gjss/sjdt/202203/t20220321_1319862.html.</w:t>
       </w:r>
+      <w:r>
+        <w:t xml:space="preserve"> </w:t>
+      </w:r>
+      <w:r>
+        <w:t xml:space="preserve">National Development and Reform Commission, High-Technology Department.</w:t>
+      </w:r>
+      <w:r>
+        <w:t xml:space="preserve"> </w:t>
+      </w:r>
+      <w:r>
+        <w:t xml:space="preserve">“Eastern Data, Western Computing”</w:t>
+      </w:r>
+      <w:r>
+        <w:t xml:space="preserve"> </w:t>
+      </w:r>
+      <w:r>
+        <w:t xml:space="preserve">fully launched: eight hubs energise data[EB/OL]. (2022-03-21)[2026-09-17]. https://www.ndrc.gov.cn/fzggw/jgsj/gjss/sjdt/202203/t20220321_1319862.html (in Chinese).</w:t>
+      </w:r>
     </w:p>
     <w:p>
       <w:pPr>
@@ -2709,49 +2806,19 @@
       <w:r>
         <w:t xml:space="preserve"> 2021.</w:t>
       </w:r>
+      <w:r>
+        <w:t xml:space="preserve"> </w:t>
+      </w:r>
+      <w:r>
+        <w:t xml:space="preserve">National Bureau of Statistics of China. China Statistical Yearbook 2021: Table 9-14 electricity consumption by region[M]. Beijing: China Statistics Press, 2021 (in Chinese).</w:t>
+      </w:r>
     </w:p>
     <w:p>
       <w:pPr>
         <w:pStyle w:val="BodyText"/>
       </w:pPr>
       <w:r>
-        <w:t xml:space="preserve">[19] Potsdam Institute for Climate Impact Research. Data bundle PyPSA-China-PIK: rasters and basic cutout, v1.1 </w:t>
-      </w:r>
-      <w:r>
-        <w:rPr>
-          <w:rFonts w:hint="eastAsia"/>
-        </w:rPr>
-        <w:t xml:space="preserve">(含</w:t>
-      </w:r>
-      <w:r>
-        <w:t xml:space="preserve"> Global Energy Monitor </w:t>
-      </w:r>
-      <w:r>
-        <w:rPr>
-          <w:rFonts w:hint="eastAsia"/>
-        </w:rPr>
-        <w:t xml:space="preserve">全球一体化电厂追踪库</w:t>
-      </w:r>
-      <w:r>
-        <w:t xml:space="preserve"> 2025 </w:t>
-      </w:r>
-      <w:r>
-        <w:rPr>
-          <w:rFonts w:hint="eastAsia"/>
-        </w:rPr>
-        <w:t xml:space="preserve">年</w:t>
-      </w:r>
-      <w:r>
-        <w:t xml:space="preserve"> 7 </w:t>
-      </w:r>
-      <w:r>
-        <w:rPr>
-          <w:rFonts w:hint="eastAsia"/>
-        </w:rPr>
-        <w:t xml:space="preserve">月中国子集)[DS/OL].</w:t>
-      </w:r>
-      <w:r>
-        <w:t xml:space="preserve"> Zenodo, 2025[2026-09-17]. https://doi.org/10.5281/zenodo.16810831.</w:t>
+        <w:t xml:space="preserve">[19] Potsdam Institute for Climate Impact Research. Data bundle PyPSA-China-PIK: rasters and basic cutout, v1.1 (containing the Global Energy Monitor Global Integrated Power Tracker, July 2025, China subset)[DS/OL]. Zenodo, 2025[2026-09-17]. https://doi.org/10.5281/zenodo.16810831.</w:t>
       </w:r>
     </w:p>
     <w:p>

</xml_diff>

<commit_message>
Chinese manuscript: Fujian Normal University postcode 350007 (Cangshan campus)
Co-Authored-By: Claude Opus 5 <noreply@anthropic.com>
</commit_message>
<xml_diff>
--- a/outputs/research/manuscript/docx/中文投稿稿_v1.0.docx
+++ b/outputs/research/manuscript/docx/中文投稿稿_v1.0.docx
@@ -155,7 +155,7 @@
         <w:rPr>
           <w:rFonts w:hint="eastAsia"/>
         </w:rPr>
-        <w:t xml:space="preserve">350117）</w:t>
+        <w:t xml:space="preserve">350007）</w:t>
       </w:r>
     </w:p>
     <w:p>
@@ -345,7 +345,7 @@
         <w:pStyle w:val="BodyText"/>
       </w:pPr>
       <w:r>
-        <w:t xml:space="preserve">(1. School of Computer Science, Faculty of Engineering and Physical Sciences, University of Leeds, Leeds LS2 9JT, UK; 2. School of Public Administration, Fujian Normal University, Fuzhou 350117, Fujian Province, China)</w:t>
+        <w:t xml:space="preserve">(1. School of Computer Science, Faculty of Engineering and Physical Sciences, University of Leeds, Leeds LS2 9JT, UK; 2. School of Public Administration, Fujian Normal University, Fuzhou 350007, Fujian Province, China)</w:t>
       </w:r>
     </w:p>
     <w:p>

</xml_diff>